<commit_message>
Differentiate stats and flow across Idaho Hispanic Foundation posts
Colleen's guidance is that posts should not share a stat or a structure.
The first pass reused the ALICE figure in three of four posts and ran
the same shape in three. Each post now carries its own statistic and
its own paragraph order.

Co-Authored-By: Claude Opus 5 <noreply@anthropic.com>
Claude-Session: https://claude.ai/code/session_01HHV2xKdnP4FvnPx6AG9vDv
</commit_message>
<xml_diff>
--- a/output/260928_MHID_Idaho_Hispanic_Foundation_Toolkit_TRACKED.docx
+++ b/output/260928_MHID_Idaho_Hispanic_Foundation_Toolkit_TRACKED.docx
@@ -232,7 +232,7 @@
             <w:sz w:val="24"/>
             <w:szCs w:val="24"/>
           </w:rPr>
-          <w:t xml:space="preserve">Nearly half of all Hispanic households in Idaho live below the ALICE Threshold, meaning they cannot consistently afford housing, food, transportation, childcare and health care. IHF’s Resource Center provides support to more than 2,000 families facing financial hardship each year.</w:t>
+          <w:t xml:space="preserve">Nearly half of all Hispanic households in Idaho live below the ALICE Threshold, meaning they cannot consistently afford housing, food, transportation, childcare and health care.</w:t>
         </w:r>
       </w:ins>
     </w:p>
@@ -271,7 +271,7 @@
             <w:sz w:val="24"/>
             <w:szCs w:val="24"/>
           </w:rPr>
-          <w:t xml:space="preserve">Our Idaho team spends time at IHF events throughout the year, including their Hispanic Heritage Month celebration in Nampa this month.</w:t>
+          <w:t xml:space="preserve">Our Idaho team is at IHF events through the year, most recently their Hispanic Heritage Month celebration in Nampa.</w:t>
         </w:r>
       </w:ins>
     </w:p>
@@ -424,7 +424,7 @@
             <w:sz w:val="24"/>
             <w:szCs w:val="24"/>
           </w:rPr>
-          <w:t xml:space="preserve">Nearly half of all Hispanic households in Idaho live below the ALICE Threshold, which means they cannot consistently cover housing, food, transportation, childcare and health care. The Resource Center helps more than 2,000 families a year work through exactly that.</w:t>
+          <w:t xml:space="preserve">The Resource Center supports more than 2,000 families a year who are facing financial hardship.</w:t>
         </w:r>
       </w:ins>
     </w:p>
@@ -554,7 +554,7 @@
             <w:sz w:val="24"/>
             <w:szCs w:val="24"/>
           </w:rPr>
-          <w:t xml:space="preserve">Our team is out at IHF events across Canyon County throughout the year, including their Hispanic Heritage Month celebration in Nampa this month, where more than 250 people turned out.</w:t>
+          <w:t xml:space="preserve">Our team volunteers at IHF events across Canyon County, including their Hispanic Heritage Month celebration in Nampa this month, where more than 250 people turned out.</w:t>
         </w:r>
       </w:ins>
     </w:p>
@@ -694,7 +694,7 @@
             <w:sz w:val="24"/>
             <w:szCs w:val="24"/>
           </w:rPr>
-          <w:t xml:space="preserve">Nearly half of all Hispanic households in Idaho live below the ALICE Threshold, earning too much to qualify for most assistance and not enough to cover housing, food, transportation, childcare and health care.</w:t>
+          <w:t xml:space="preserve">About one in seven adults in Canyon County experienced food insecurity in the past year. When a household is covering costs like that, a follow-up appointment is not what rises to the top of the list.</w:t>
         </w:r>
       </w:ins>
     </w:p>
@@ -720,7 +720,7 @@
             <w:sz w:val="24"/>
             <w:szCs w:val="24"/>
           </w:rPr>
-          <w:t xml:space="preserve">A household in that position does not usually skip care because it does not value it. Care gets deferred because something more immediate comes first. The grant funds care navigation for behavioral health and primary care, health education workshops, and basic necessities for families with immediate needs, which is the order those things actually get addressed in.</w:t>
+          <w:t xml:space="preserve">The grant funds both sides of that. Care navigation for behavioral health and primary care, health education workshops, and the cold-weather items, hygiene products and household essentials families need right now.</w:t>
         </w:r>
       </w:ins>
     </w:p>
@@ -746,7 +746,7 @@
             <w:sz w:val="24"/>
             <w:szCs w:val="24"/>
           </w:rPr>
-          <w:t xml:space="preserve">IHF’s Resource Center reaches more than 2,000 families a year. Supporting an organization already doing that work is how a health plan extends its reach into a community.</w:t>
+          <w:t xml:space="preserve">Working with an organization already trusted in Canyon County is how a health plan reaches people it would not reach on its own.</w:t>
         </w:r>
       </w:ins>
     </w:p>
@@ -925,7 +925,7 @@
             <w:sz w:val="24"/>
             <w:szCs w:val="24"/>
           </w:rPr>
-          <w:t xml:space="preserve">More than a quarter of Canyon County residents are Hispanic. IHF’s Resource Center supports more than 2,000 families a year with navigation to behavioral health and primary care, health education workshops, and help with immediate needs like cold-weather items and household essentials.</w:t>
+          <w:t xml:space="preserve">More than a quarter of Canyon County residents are Hispanic. The grant supports navigation to behavioral health and primary care, health education workshops, and help with immediate needs like cold-weather items and household essentials.</w:t>
         </w:r>
       </w:ins>
     </w:p>

</xml_diff>